<commit_message>
202300848: feature: crm & Bi
</commit_message>
<xml_diff>
--- a/Entrega_Fase3_Grupo14/_Referencia/rol4/03_BORRADOR_MU-06.docx
+++ b/Entrega_Fase3_Grupo14/_Referencia/rol4/03_BORRADOR_MU-06.docx
@@ -25,6 +25,11 @@
           <w:color w:val="C00000"/>
         </w:rPr>
         <w:t>BORRADOR · No es el archivo de entrega</w:t>
+      </w:r>
+    </w:p>
+    <w:p>
+      <w:r>
+        <w:t>Nota del 23-10 (instancia real): los precios son con IVA incluido; la historia da Q 14,679.50 con IVA y Q 13,106.67 sin IVA. La base ya tiene 50 pedidos: 45 de la historia y 5 de la Fase 2. Al corte, Odoo reporta CAS-005 y ELE-002 bajo el mínimo. Los números de este borrador son del plan: al capturar, usar los de Odoo y explicar la diferencia.</w:t>
       </w:r>
     </w:p>
     <w:p>
@@ -168,13 +173,7 @@
         <w:spacing w:after="40"/>
       </w:pPr>
       <w:r>
-        <w:rPr>
-          <w:b/>
-        </w:rPr>
-        <w:t xml:space="preserve">Qué se hace: </w:t>
-      </w:r>
-      <w:r>
-        <w:t>Se busca el lead por el nombre de Mónica. Se abre la ficha y se comprueba que el correo, el teléfono y el mensaje son los del formulario, y que el origen es Sitio web.</w:t>
+        <w:t>Qué se hace: Se busca el lead por el nombre de Mónica. Se abre la ficha y se comprueba que el correo, el teléfono y el mensaje son los del formulario, y que los datos son los del formulario. En esta instancia el campo Origen quedó vacío; se anota como diferencia.</w:t>
       </w:r>
     </w:p>
     <w:p>
@@ -182,13 +181,7 @@
         <w:spacing w:after="40"/>
       </w:pPr>
       <w:r>
-        <w:rPr>
-          <w:b/>
-        </w:rPr>
-        <w:t xml:space="preserve">Qué se ve: </w:t>
-      </w:r>
-      <w:r>
-        <w:t>La tarjeta del lead en la primera etapa y, en la ficha, el origen del sitio. Esa es la prueba de que el formulario está conectado al CRM.</w:t>
+        <w:t>Qué se ve: La tarjeta del lead en la primera etapa y, en la ficha, los datos del formulario. El campo Origen no quedó registrado; la prueba de la conexión es el lead con el mensaje.</w:t>
       </w:r>
     </w:p>
     <w:p>
@@ -196,13 +189,7 @@
         <w:spacing w:after="40"/>
       </w:pPr>
       <w:r>
-        <w:rPr>
-          <w:b/>
-        </w:rPr>
-        <w:t xml:space="preserve">Captura: </w:t>
-      </w:r>
-      <w:r>
-        <w:t>[Captura: lead en el pipeline con el origen Sitio web]; [Captura: ficha del lead con el mensaje].</w:t>
+        <w:t>Captura: [Captura: lead en el pipeline con los datos del formulario]; [Captura: ficha del lead con el mensaje].</w:t>
       </w:r>
     </w:p>
     <w:p>
@@ -210,13 +197,7 @@
         <w:spacing w:after="40"/>
       </w:pPr>
       <w:r>
-        <w:rPr>
-          <w:b/>
-        </w:rPr>
-        <w:t xml:space="preserve">Dato que hay que anotar: </w:t>
-      </w:r>
-      <w:r>
-        <w:t>nombre del lead, etapa, origen y fecha.</w:t>
+        <w:t>Dato que hay que anotar: nombre del lead, etapa y fecha; si el campo Origen está vacío, anotarlo.</w:t>
       </w:r>
     </w:p>
     <w:p>
@@ -246,13 +227,7 @@
         <w:spacing w:after="40"/>
       </w:pPr>
       <w:r>
-        <w:rPr>
-          <w:b/>
-        </w:rPr>
-        <w:t xml:space="preserve">Qué se hace: </w:t>
-      </w:r>
-      <w:r>
-        <w:t>Se convierte el lead en oportunidad, se vincula al cliente existente Mónica Isabel Arévalo Soto y se crea la cotización con CAS-005 ×1 y CAS-006 ×1. Se comprueba el precio de lista: Q 680 + Q 180 = Q 860, sin impuestos.</w:t>
+        <w:t>Qué se hace: Se convierte el lead en oportunidad, se vincula al cliente existente Mónica Isabel Arévalo Soto y se crea la cotización con CAS-005 ×1 y CAS-006 ×1. Se comprueba el precio de lista: Q 680 + Q 180 = Q 860, con IVA incluido.</w:t>
       </w:r>
     </w:p>
     <w:p>
@@ -402,13 +377,7 @@
         <w:spacing w:after="40"/>
       </w:pPr>
       <w:r>
-        <w:rPr>
-          <w:b/>
-        </w:rPr>
-        <w:t xml:space="preserve">Qué se hace: </w:t>
-      </w:r>
-      <w:r>
-        <w:t>Se abre el enlace en una sesión de incógnito, se inicia sesión como Mónica, se revisa la cotización y se acepta. Se paga con el proveedor de prueba.</w:t>
+        <w:t>Qué se hace: Se abre el enlace en una sesión de incógnito, se inicia sesión como Mónica, se revisa la cotización y se acepta. Se paga con el medio publicado (transferencia o Demo); si es transferencia, el pago se registra a mano en la factura.</w:t>
       </w:r>
     </w:p>
     <w:p>
@@ -430,13 +399,7 @@
         <w:spacing w:after="40"/>
       </w:pPr>
       <w:r>
-        <w:rPr>
-          <w:b/>
-        </w:rPr>
-        <w:t xml:space="preserve">Captura: </w:t>
-      </w:r>
-      <w:r>
-        <w:t>[Captura: cotización en el portal]; [Captura: pago de prueba]; [Captura: pedido confirmado].</w:t>
+        <w:t>Captura: [Captura: cotización en el portal]; [Captura: medio de pago (transferencia o Demo)]; [Captura: pedido confirmado].</w:t>
       </w:r>
     </w:p>
     <w:p>
@@ -494,13 +457,7 @@
         <w:spacing w:after="40"/>
       </w:pPr>
       <w:r>
-        <w:rPr>
-          <w:b/>
-        </w:rPr>
-        <w:t xml:space="preserve">Qué se ve: </w:t>
-      </w:r>
-      <w:r>
-        <w:t>La entrega en estado Hecho y la factura en estado Pagada, con el mismo número de pedido. CAS-005 pasa de 2 a 1 y CAS-006 de 10 a 9.</w:t>
+        <w:t>Qué se ve: La entrega en estado Hecho y la factura en estado Pagada, con el mismo número de pedido. El plan preveía CAS-005 en 1 y CAS-006 en 9; anotar la existencia real antes y después (puede cambiar por los pedidos de la Fase 2).</w:t>
       </w:r>
     </w:p>
     <w:p>
@@ -508,13 +465,7 @@
         <w:spacing w:after="40"/>
       </w:pPr>
       <w:r>
-        <w:rPr>
-          <w:b/>
-        </w:rPr>
-        <w:t xml:space="preserve">Captura: </w:t>
-      </w:r>
-      <w:r>
-        <w:t>[Captura: entrega validada]; [Captura: factura pagada].</w:t>
+        <w:t>Captura: [Captura: entrega validada]; [Captura: factura pagada o pago registrado].</w:t>
       </w:r>
     </w:p>
     <w:p>
@@ -621,12 +572,8 @@
             <w:tcW w:type="dxa" w:w="4535"/>
           </w:tcPr>
           <w:p>
-            <w:r/>
             <w:r>
-              <w:rPr>
-                <w:sz w:val="19"/>
-              </w:rPr>
-              <w:t>Lead con origen Sitio web</w:t>
+              <w:t>Lead con los datos del formulario (origen no registrado)</w:t>
             </w:r>
           </w:p>
         </w:tc>
@@ -635,11 +582,8 @@
             <w:tcW w:type="dxa" w:w="2041"/>
           </w:tcPr>
           <w:p>
-            <w:r/>
             <w:r>
-              <w:rPr>
-                <w:sz w:val="19"/>
-              </w:rPr>
+              <w:t>Sí: lead del 23-10; origen vacío</w:t>
             </w:r>
           </w:p>
         </w:tc>
@@ -678,11 +622,8 @@
             <w:tcW w:type="dxa" w:w="2041"/>
           </w:tcPr>
           <w:p>
-            <w:r/>
             <w:r>
-              <w:rPr>
-                <w:sz w:val="19"/>
-              </w:rPr>
+              <w:t>Sí: Mónica; etapa Ganado</w:t>
             </w:r>
           </w:p>
         </w:tc>
@@ -721,11 +662,8 @@
             <w:tcW w:type="dxa" w:w="2041"/>
           </w:tcPr>
           <w:p>
-            <w:r/>
             <w:r>
-              <w:rPr>
-                <w:sz w:val="19"/>
-              </w:rPr>
+              <w:t>S00055 · Q 860.00 con IVA</w:t>
             </w:r>
           </w:p>
         </w:tc>
@@ -764,11 +702,8 @@
             <w:tcW w:type="dxa" w:w="2041"/>
           </w:tcPr>
           <w:p>
-            <w:r/>
             <w:r>
-              <w:rPr>
-                <w:sz w:val="19"/>
-              </w:rPr>
+              <w:t>Mailpit · Cotización S00055</w:t>
             </w:r>
           </w:p>
         </w:tc>
@@ -807,11 +742,8 @@
             <w:tcW w:type="dxa" w:w="2041"/>
           </w:tcPr>
           <w:p>
-            <w:r/>
             <w:r>
-              <w:rPr>
-                <w:sz w:val="19"/>
-              </w:rPr>
+              <w:t>Factura INV/2026/00054 pagada</w:t>
             </w:r>
           </w:p>
         </w:tc>
@@ -850,11 +782,8 @@
             <w:tcW w:type="dxa" w:w="2041"/>
           </w:tcPr>
           <w:p>
-            <w:r/>
             <w:r>
-              <w:rPr>
-                <w:sz w:val="19"/>
-              </w:rPr>
+              <w:t>RMT/OUT/00053 hecha; CAS-005 1/2</w:t>
             </w:r>
           </w:p>
         </w:tc>
@@ -893,11 +822,8 @@
             <w:tcW w:type="dxa" w:w="2041"/>
           </w:tcPr>
           <w:p>
-            <w:r/>
             <w:r>
-              <w:rPr>
-                <w:sz w:val="19"/>
-              </w:rPr>
+              <w:t>S00056 · Q 364.50 · INV/2026/00056 · RMT/OUT/00054</w:t>
             </w:r>
           </w:p>
         </w:tc>
@@ -1132,13 +1058,7 @@
         <w:spacing w:after="40"/>
       </w:pPr>
       <w:r>
-        <w:rPr>
-          <w:b/>
-        </w:rPr>
-        <w:t xml:space="preserve">Qué se ve: </w:t>
-      </w:r>
-      <w:r>
-        <w:t>La tabla con producto, mínimo, existencia y cantidad a pedir. Los cuatro productos bajo el mínimo son CAS-005, ELE-002, FRE-004 y LUB-001.</w:t>
+        <w:t>Qué se ve: La tabla con producto, mínimo, existencia y cantidad a pedir. Al corte, Odoo reporta CAS-005 (1/2) y ELE-002 (12/30); el plan preveía cuatro (CAS-005, ELE-002, FRE-004 y LUB-001). Con los pedidos del sitio puede cambiar: usar lo que muestre Odoo y explicar la diferencia.</w:t>
       </w:r>
     </w:p>
     <w:p>
@@ -1160,13 +1080,7 @@
         <w:spacing w:after="40"/>
       </w:pPr>
       <w:r>
-        <w:rPr>
-          <w:b/>
-        </w:rPr>
-        <w:t xml:space="preserve">Dato que hay que anotar: </w:t>
-      </w:r>
-      <w:r>
-        <w:t>lista y valores de los cuatro productos.</w:t>
+        <w:t>Dato que hay que anotar: lista y valores reales; el plan preveía cuatro, pero manda Odoo.</w:t>
       </w:r>
     </w:p>
     <w:p>
@@ -1273,11 +1187,8 @@
             <w:tcW w:type="dxa" w:w="2041"/>
           </w:tcPr>
           <w:p>
-            <w:r/>
             <w:r>
-              <w:rPr>
-                <w:sz w:val="19"/>
-              </w:rPr>
+              <w:t>38</w:t>
             </w:r>
           </w:p>
         </w:tc>
@@ -1316,11 +1227,8 @@
             <w:tcW w:type="dxa" w:w="2041"/>
           </w:tcPr>
           <w:p>
-            <w:r/>
             <w:r>
-              <w:rPr>
-                <w:sz w:val="19"/>
-              </w:rPr>
+              <w:t>6</w:t>
             </w:r>
           </w:p>
         </w:tc>
@@ -1345,12 +1253,8 @@
             <w:tcW w:type="dxa" w:w="4535"/>
           </w:tcPr>
           <w:p>
-            <w:r/>
             <w:r>
-              <w:rPr>
-                <w:sz w:val="19"/>
-              </w:rPr>
-              <w:t>4: CAS-005, ELE-002, FRE-004, LUB-001</w:t>
+              <w:t>Plan: 4; Odoo al corte: CAS-005 y ELE-002</w:t>
             </w:r>
           </w:p>
         </w:tc>
@@ -1359,11 +1263,8 @@
             <w:tcW w:type="dxa" w:w="2041"/>
           </w:tcPr>
           <w:p>
-            <w:r/>
             <w:r>
-              <w:rPr>
-                <w:sz w:val="19"/>
-              </w:rPr>
+              <w:t>CAS-005 (1/2), ELE-002 (12/30)</w:t>
             </w:r>
           </w:p>
         </w:tc>
@@ -1402,11 +1303,8 @@
             <w:tcW w:type="dxa" w:w="2041"/>
           </w:tcPr>
           <w:p>
-            <w:r/>
             <w:r>
-              <w:rPr>
-                <w:sz w:val="19"/>
-              </w:rPr>
+              <w:t>0</w:t>
             </w:r>
           </w:p>
         </w:tc>
@@ -1513,13 +1411,7 @@
         <w:spacing w:after="40"/>
       </w:pPr>
       <w:r>
-        <w:rPr>
-          <w:b/>
-        </w:rPr>
-        <w:t xml:space="preserve">Dato que hay que anotar: </w:t>
-      </w:r>
-      <w:r>
-        <w:t>56 pedidos y Q 19,111.00; fecha inicial y final.</w:t>
+        <w:t>Dato que hay que anotar: El plan preveía 56 pedidos (45 historia + 11 sitio) y Q 19,111.00 con IVA; la historia sin IVA es Q 13,106.67. Si Odoo incluye pedidos de la Fase 2, el total es mayor: anotar el número real y explicarlo.</w:t>
       </w:r>
     </w:p>
     <w:p>
@@ -1641,13 +1533,7 @@
         <w:spacing w:after="40"/>
       </w:pPr>
       <w:r>
-        <w:rPr>
-          <w:b/>
-        </w:rPr>
-        <w:t xml:space="preserve">Qué se ve: </w:t>
-      </w:r>
-      <w:r>
-        <w:t>Ventas directas (WhatsApp y teléfono) Q 14,679.50 y Website Sales Q 4,431.50; total Q 19,111.00. El margen se lee de la medida Margen.</w:t>
+        <w:t>Qué se ve: Ventas directas (WhatsApp y teléfono) Q 14,679.50 y Website Sales Q 4,431.50; total Q 19,111.00 con IVA incluido (la historia sin IVA es Q 13,106.67). El margen se lee de la medida Margen. Si hay pedidos de la Fase 2, el canal directo los incluye.</w:t>
       </w:r>
     </w:p>
     <w:p>
@@ -1846,12 +1732,8 @@
             <w:tcW w:type="dxa" w:w="4535"/>
           </w:tcPr>
           <w:p>
-            <w:r/>
             <w:r>
-              <w:rPr>
-                <w:sz w:val="19"/>
-              </w:rPr>
-              <w:t>56</w:t>
+              <w:t>56 del plan (45+11); Odoo puede incluir 5 de la Fase 2</w:t>
             </w:r>
           </w:p>
         </w:tc>
@@ -1889,12 +1771,8 @@
             <w:tcW w:type="dxa" w:w="4535"/>
           </w:tcPr>
           <w:p>
-            <w:r/>
             <w:r>
-              <w:rPr>
-                <w:sz w:val="19"/>
-              </w:rPr>
-              <w:t>Q 19,111.00</w:t>
+              <w:t>Q 19,111.00 con IVA (historia sin IVA Q 13,106.67)</w:t>
             </w:r>
           </w:p>
         </w:tc>
@@ -1932,12 +1810,8 @@
             <w:tcW w:type="dxa" w:w="4535"/>
           </w:tcPr>
           <w:p>
-            <w:r/>
             <w:r>
-              <w:rPr>
-                <w:sz w:val="19"/>
-              </w:rPr>
-              <w:t>45 pedidos · Q 14,679.50</w:t>
+              <w:t>45 pedidos · Q 14,679.50 con IVA</w:t>
             </w:r>
           </w:p>
         </w:tc>
@@ -1946,11 +1820,8 @@
             <w:tcW w:type="dxa" w:w="2041"/>
           </w:tcPr>
           <w:p>
-            <w:r/>
             <w:r>
-              <w:rPr>
-                <w:sz w:val="19"/>
-              </w:rPr>
+              <w:t>45 pedidos · Q 14,679.50 con IVA</w:t>
             </w:r>
           </w:p>
         </w:tc>
@@ -1975,12 +1846,8 @@
             <w:tcW w:type="dxa" w:w="4535"/>
           </w:tcPr>
           <w:p>
-            <w:r/>
             <w:r>
-              <w:rPr>
-                <w:sz w:val="19"/>
-              </w:rPr>
-              <w:t>11 pedidos · Q 4,431.50</w:t>
+              <w:t>11 pedidos · Q 4,431.50 con IVA</w:t>
             </w:r>
           </w:p>
         </w:tc>
@@ -1989,11 +1856,8 @@
             <w:tcW w:type="dxa" w:w="2041"/>
           </w:tcPr>
           <w:p>
-            <w:r/>
             <w:r>
-              <w:rPr>
-                <w:sz w:val="19"/>
-              </w:rPr>
+              <w:t>4 de 11 al corte · Q 1,529.50 con IVA (verificar al capturar)</w:t>
             </w:r>
           </w:p>
         </w:tc>
@@ -2061,12 +1925,8 @@
             <w:tcW w:type="dxa" w:w="4535"/>
           </w:tcPr>
           <w:p>
-            <w:r/>
             <w:r>
-              <w:rPr>
-                <w:sz w:val="19"/>
-              </w:rPr>
-              <w:t>Directo Q 14,679.50 · Sitio Q 4,431.50</w:t>
+              <w:t>Directo Q 14,679.50 · Sitio Q 4,431.50 (con IVA)</w:t>
             </w:r>
           </w:p>
         </w:tc>

</xml_diff>

<commit_message>
docs: informes y mu
</commit_message>
<xml_diff>
--- a/Entrega_Fase3_Grupo14/_Referencia/rol4/03_BORRADOR_MU-06.docx
+++ b/Entrega_Fase3_Grupo14/_Referencia/rol4/03_BORRADOR_MU-06.docx
@@ -874,13 +874,7 @@
         <w:spacing w:after="40"/>
       </w:pPr>
       <w:r>
-        <w:rPr>
-          <w:b/>
-        </w:rPr>
-        <w:t xml:space="preserve">Ruta: </w:t>
-      </w:r>
-      <w:r>
-        <w:t>Inventario › Informes › Existencias › vista Gráfico › Barras, agrupado por Producto.</w:t>
+        <w:t>Ruta: Inventario › Informes › Ubicaciones › Gráfico › Barras, medida Cantidad en inventario, filtrado a RMT/Existencias y agrupado por Producto. (el reporte Existencias es una lista; el gráfico está en Ubicaciones).</w:t>
       </w:r>
     </w:p>
     <w:p>
@@ -952,13 +946,7 @@
         <w:spacing w:after="40"/>
       </w:pPr>
       <w:r>
-        <w:rPr>
-          <w:b/>
-        </w:rPr>
-        <w:t xml:space="preserve">Ruta: </w:t>
-      </w:r>
-      <w:r>
-        <w:t>La misma vista › Pastel, agrupado por Categoría de producto.</w:t>
+        <w:t>Ruta: La misma vista de Ubicaciones › Pastel, agrupado por Categoría de producto.</w:t>
       </w:r>
     </w:p>
     <w:p>
@@ -1411,7 +1399,7 @@
         <w:spacing w:after="40"/>
       </w:pPr>
       <w:r>
-        <w:t>Dato que hay que anotar: El plan preveía 56 pedidos (45 historia + 11 sitio) y Q 19,111.00 con IVA; la historia sin IVA es Q 13,106.67. Si Odoo incluye pedidos de la Fase 2, el total es mayor: anotar el número real y explicarlo.</w:t>
+        <w:t>Dato que hay que anotar: al corte, Odoo mostró 58 pedidos y Q 19,251.00 con IVA: Q 14,679.50 de historia y Q 4,571.50 del sitio. El plan preveía 56 y Q 19,111.00; la diferencia son 2 pedidos extra del sitio y Q 140.00 de fletes/ajustes. Si se suman los pedidos de la Fase 2 en Sales, el total sube a Q 20,961.00.</w:t>
       </w:r>
     </w:p>
     <w:p>
@@ -1455,13 +1443,7 @@
         <w:spacing w:after="40"/>
       </w:pPr>
       <w:r>
-        <w:rPr>
-          <w:b/>
-        </w:rPr>
-        <w:t xml:space="preserve">Qué se ve: </w:t>
-      </w:r>
-      <w:r>
-        <w:t>El top 5: LUB-001 (45), LUB-004 (21), ELE-007 (13), FRE-001 (12), ELE-003 (11). Entre los cinco, 102 de 179 unidades (57 %).</w:t>
+        <w:t>Qué se ve: al corte, el top 5 es LUB-001 (52), LUB-004 (21), ELE-007 (13), FRE-001 (12) y ELE-003 (11), excluyendo el producto de flete Delivery_007 (11 unidades). El plan estimaba LUB-001 (45), LUB-004 (21), ELE-007 (13), FRE-001 (12) y ELE-003 (11); el top 5 real suma 109 unidades.</w:t>
       </w:r>
     </w:p>
     <w:p>
@@ -1533,7 +1515,7 @@
         <w:spacing w:after="40"/>
       </w:pPr>
       <w:r>
-        <w:t>Qué se ve: Ventas directas (WhatsApp y teléfono) Q 14,679.50 y Website Sales Q 4,431.50; total Q 19,111.00 con IVA incluido (la historia sin IVA es Q 13,106.67). El margen se lee de la medida Margen. Si hay pedidos de la Fase 2, el canal directo los incluye.</w:t>
+        <w:t>Qué se ve: Website Q 4,571.50 con IVA (Q 4,081.69 sin IVA) y margen Q 1,217.69; Ventas directas Q 14,679.50 (Q 13,106.67 sin IVA) y margen Q 3,781.67; Sales (Fase 2) Q 1,710.00 y margen Q 310.78. Historia + sitio = Q 19,251.00; si se suman los pedidos de la Fase 2, Q 20,961.00. El margen se lee de la medida Margen.</w:t>
       </w:r>
     </w:p>
     <w:p>
@@ -1733,7 +1715,7 @@
           </w:tcPr>
           <w:p>
             <w:r>
-              <w:t>56 del plan (45+11); Odoo puede incluir 5 de la Fase 2</w:t>
+              <w:t>58 (45 historia + 13 sitio)</w:t>
             </w:r>
           </w:p>
         </w:tc>
@@ -1742,11 +1724,8 @@
             <w:tcW w:type="dxa" w:w="2041"/>
           </w:tcPr>
           <w:p>
-            <w:r/>
             <w:r>
-              <w:rPr>
-                <w:sz w:val="19"/>
-              </w:rPr>
+              <w:t>58</w:t>
             </w:r>
           </w:p>
         </w:tc>
@@ -1772,7 +1751,7 @@
           </w:tcPr>
           <w:p>
             <w:r>
-              <w:t>Q 19,111.00 con IVA (historia sin IVA Q 13,106.67)</w:t>
+              <w:t>Q 19,251.00 con IVA (historia sin IVA Q 13,106.67)</w:t>
             </w:r>
           </w:p>
         </w:tc>
@@ -1781,11 +1760,8 @@
             <w:tcW w:type="dxa" w:w="2041"/>
           </w:tcPr>
           <w:p>
-            <w:r/>
             <w:r>
-              <w:rPr>
-                <w:sz w:val="19"/>
-              </w:rPr>
+              <w:t>Q 19,251.00</w:t>
             </w:r>
           </w:p>
         </w:tc>
@@ -1847,7 +1823,7 @@
           </w:tcPr>
           <w:p>
             <w:r>
-              <w:t>11 pedidos · Q 4,431.50 con IVA</w:t>
+              <w:t>13 pedidos · Q 4,571.50 con IVA</w:t>
             </w:r>
           </w:p>
         </w:tc>
@@ -1857,7 +1833,7 @@
           </w:tcPr>
           <w:p>
             <w:r>
-              <w:t>4 de 11 al corte · Q 1,529.50 con IVA (verificar al capturar)</w:t>
+              <w:t>13 · Q 4,571.50</w:t>
             </w:r>
           </w:p>
         </w:tc>
@@ -1882,12 +1858,8 @@
             <w:tcW w:type="dxa" w:w="4535"/>
           </w:tcPr>
           <w:p>
-            <w:r/>
             <w:r>
-              <w:rPr>
-                <w:sz w:val="19"/>
-              </w:rPr>
-              <w:t>LUB-001 45, LUB-004 21, ELE-007 13, FRE-001 12, ELE-003 11</w:t>
+              <w:t>Plan: 45, 21, 13, 12, 11</w:t>
             </w:r>
           </w:p>
         </w:tc>
@@ -1896,11 +1868,8 @@
             <w:tcW w:type="dxa" w:w="2041"/>
           </w:tcPr>
           <w:p>
-            <w:r/>
             <w:r>
-              <w:rPr>
-                <w:sz w:val="19"/>
-              </w:rPr>
+              <w:t>52, 21, 13, 12, 11 (sin Delivery_007)</w:t>
             </w:r>
           </w:p>
         </w:tc>
@@ -1926,7 +1895,7 @@
           </w:tcPr>
           <w:p>
             <w:r>
-              <w:t>Directo Q 14,679.50 · Sitio Q 4,431.50 (con IVA)</w:t>
+              <w:t>Directo Q 14,679.50 · Sitio Q 4,571.50 (con IVA)</w:t>
             </w:r>
           </w:p>
         </w:tc>
@@ -1935,11 +1904,8 @@
             <w:tcW w:type="dxa" w:w="2041"/>
           </w:tcPr>
           <w:p>
-            <w:r/>
             <w:r>
-              <w:rPr>
-                <w:sz w:val="19"/>
-              </w:rPr>
+              <w:t>Directo Q 14,679.50 · Sitio Q 4,571.50</w:t>
             </w:r>
           </w:p>
         </w:tc>
@@ -1964,11 +1930,7 @@
             <w:tcW w:type="dxa" w:w="4535"/>
           </w:tcPr>
           <w:p>
-            <w:r/>
             <w:r>
-              <w:rPr>
-                <w:sz w:val="19"/>
-              </w:rPr>
               <w:t>7 reportes juntos</w:t>
             </w:r>
           </w:p>
@@ -1978,11 +1940,8 @@
             <w:tcW w:type="dxa" w:w="2041"/>
           </w:tcPr>
           <w:p>
-            <w:r/>
             <w:r>
-              <w:rPr>
-                <w:sz w:val="19"/>
-              </w:rPr>
+              <w:t>Pendiente / no incluido</w:t>
             </w:r>
           </w:p>
         </w:tc>

</xml_diff>